<commit_message>
docs(baic): report the executed device-bundle audit at ladder level 0
The declared equipment table now matches the biomedical toy run: model
risk 3, physics-based labels, and level 0. Regulatory tags do not raise
the ladder. HE01 remains the quantitative campaign.
</commit_message>
<xml_diff>
--- a/paper/baic/BAIC2026_Jamei_final.docx
+++ b/paper/baic/BAIC2026_Jamei_final.docx
@@ -98,7 +98,7 @@
           <w:rtl w:val="1"/>
           <w:lang w:val="en-US" w:bidi="fa-IR" w:eastAsia="fa-IR"/>
         </w:rPr>
-        <w:t xml:space="preserve">چکیده - تناسب شواهد با ادعا، نه فقط یک عدد دقت، کیفیت مدل محاسباتی را در مهندسی پزشکی تعیین می‌کند. این مقاله کودون‌تریس جنسیس را به‌عنوان بستری واحد برای اجرای قطعی جهان شبیه‌سازی، مداخلهٔ علّی روی یال‌های سازوکار، و حسابرسی ادعا با نردبان شش‌سطحی معرفی می‌کند. موتور اجرا حوزه نمی‌شناسد؛ حوزه از پورت DomainProfile و آداپتور بستهٔ شواهد می‌آید. پروفایل زیست‌پزشکی همان نردبان را به واژگان ASME V&amp;V 40، راهنمای FDA ۲۰۲۳ برای اعتبار مدل‌سازی محاسباتی، IEC 62304 و IMDRF وصل می‌کند. ارزیابی روی کمپین تأییدی پیش‌ثبت‌شدهٔ HE01 با ۳۰ بذر جفتی انجام شد. سنجهٔ اولیه میانگین انرژی پایانی گیرنده است. در برابر کنترل کانالِ روشن بدون سوگیری منشأ، تفاضل ۱۶٫۴۹ واحد با بازهٔ اطمینان BCa [۱۴٫۲۵، ۱۹٫۱۴] به‌دست آمد. دستاورد، زیرساخت اجرایی ممیزی ادعاست که برای مدل‌های in silico تجهیزات از همان پورت قابل اتصال است.</w:t>
+        <w:t>چکیده - تناسب شواهد با ادعا، نه فقط یک عدد دقت، کیفیت مدل محاسباتی را در مهندسی پزشکی تعیین می‌کند. این مقاله کودون‌تریس جنسیس را به‌عنوان بستری واحد برای اجرای قطعی جهان شبیه‌سازی، مداخلهٔ علّی روی یال‌های سازوکار، و حسابرسی ادعا با نردبان شش‌سطحی معرفی می‌کند. موتور اجرا حوزه نمی‌شناسد؛ حوزه از پورت DomainProfile و آداپتور بستهٔ شواهد می‌آید. پروفایل زیست‌پزشکی همان نردبان را به واژگان ASME V&amp;V 40، راهنمای FDA ۲۰۲۳ برای اعتبار مدل‌سازی محاسباتی، IEC 62304 و IMDRF وصل می‌کند. در کمپین تأییدی HE01 با ۳۰ بذر جفتی، تفاضل انرژی در برابر کنترل کانالِ روشن ۱۶٫۴۹ واحد و بازهٔ BCa [۱۴٫۲۵، ۱۹٫۱۴] بود. اجرای همان حسابرس روی بستهٔ اعلامی یک مدل تجهیز، با ریسک مدل ۳ و برچسب‌های IEC و FDA، سطح صفر برگرداند.</w:t>
       </w:r>
     </w:p>
     <w:p>
@@ -194,7 +194,7 @@
           <w:rtl w:val="1"/>
           <w:lang w:val="en-US" w:bidi="fa-IR" w:eastAsia="fa-IR"/>
         </w:rPr>
-        <w:t xml:space="preserve">سهم این مقاله سه بخش است: (۱) یکپارچه‌سازی اجرای قطعی، مداخلهٔ یال‌به‌یال و حسابرسی شواهد در بستری که موتور آن برای پزشکی بازنویسی نمی‌شود؛ (۲) پروفایل زیست‌پزشکی که همان نردبان را به واژگان تنظیم‌گری وصل می‌کند؛ (۳) ارزیابی کمّی روی کمپین تأییدی منتشرشده و یک نمونهٔ اعلامی مدل تجهیز. تازگی مورد ادعا در این ترکیب اجرایی است.</w:t>
+        <w:t>سهم این مقاله سه بخش است: (۱) یکپارچه‌سازی اجرای قطعی، مداخلهٔ یال‌به‌یال و حسابرسی شواهد در بستری که موتور آن برای پزشکی بازنویسی نمی‌شود؛ (۲) پروفایل زیست‌پزشکی که همان نردبان را به واژگان تنظیم‌گری وصل می‌کند؛ (۳) دو ارزیابی روی همان حسابرس: کمپین تأییدی HE01، و اجرای بستهٔ اعلامی یک مدل تجهیز که با ریسک مدل ۳ در سطح صفر ماند. تازگی مورد ادعا در این ترکیب اجرایی است.</w:t>
       </w:r>
     </w:p>
     <w:p>
@@ -2136,7 +2136,7 @@
           <w:rtl w:val="1"/>
           <w:lang w:val="en-US" w:bidi="fa-IR" w:eastAsia="fa-IR"/>
         </w:rPr>
-        <w:t xml:space="preserve">جدول ۳ یک نمونهٔ اعلامی را نشان می‌دهد. اعداد آن برای نمایش قالب بسته است. سطح نردبان روی چنین جدولی فقط درجهٔ یک ادعاست.</w:t>
+        <w:t>جدول ۳ همان بسته‌ای است که حسابرس روی آن اجرا شده است: امتیازها مصنوعی‌اند، آزمون ISO 14879-1 و ایمپلنت در کار نیست، و سطح حاصل صفر است.</w:t>
       </w:r>
     </w:p>
     <w:p>
@@ -2154,7 +2154,7 @@
           <w:rtl w:val="1"/>
           <w:lang w:val="en-US" w:bidi="fa-IR" w:eastAsia="fa-IR"/>
         </w:rPr>
-        <w:t xml:space="preserve">جدول ۳: نمونهٔ اعلامی مدل تجهیز (غیر بالینی)</w:t>
+        <w:t>جدول ۳: بستهٔ اعلامی مدل تجهیز؛ خروجی حسابرس سطح ۰</w:t>
       </w:r>
     </w:p>
     <w:tbl>
@@ -2314,7 +2314,9 @@
               <w:jc w:val="center"/>
               <w:bidi w:val="1"/>
             </w:pPr>
-            <w:r/>
+            <w:r>
+              <w:t>جدول مصنوعی؛ بدون ISO و ایمپلنت</w:t>
+            </w:r>
             <w:r>
               <w:rPr>
                 <w:rFonts w:ascii="Times New Roman" w:hAnsi="Times New Roman" w:cs="B Nazanin" w:eastAsia="B Nazanin"/>
@@ -2323,7 +2325,6 @@
                 <w:rtl w:val="1"/>
                 <w:lang w:val="en-US" w:bidi="fa-IR" w:eastAsia="fa-IR"/>
               </w:rPr>
-              <w:t>جدول اعلامی؛ بدون ایمپلنت</w:t>
             </w:r>
           </w:p>
         </w:tc>
@@ -2406,7 +2407,9 @@
               <w:jc w:val="center"/>
               <w:bidi w:val="1"/>
             </w:pPr>
-            <w:r/>
+            <w:r>
+              <w:t>۲ / ۳؛ ریسک مدل ۳</w:t>
+            </w:r>
             <w:r>
               <w:rPr>
                 <w:rFonts w:ascii="Times New Roman" w:hAnsi="Times New Roman" w:cs="B Nazanin" w:eastAsia="B Nazanin"/>
@@ -2415,7 +2418,6 @@
                 <w:rtl w:val="1"/>
                 <w:lang w:val="en-US" w:bidi="fa-IR" w:eastAsia="fa-IR"/>
               </w:rPr>
-              <w:t>۲ / ۳</w:t>
             </w:r>
           </w:p>
         </w:tc>
@@ -2866,7 +2868,9 @@
               <w:jc w:val="center"/>
               <w:bidi w:val="1"/>
             </w:pPr>
-            <w:r/>
+            <w:r>
+              <w:t>بله؛ سطح نردبان همچنان ۰</w:t>
+            </w:r>
             <w:r>
               <w:rPr>
                 <w:rFonts w:ascii="Times New Roman" w:hAnsi="Times New Roman" w:cs="B Nazanin" w:eastAsia="B Nazanin"/>
@@ -2875,7 +2879,6 @@
                 <w:rtl w:val="1"/>
                 <w:lang w:val="en-US" w:bidi="fa-IR" w:eastAsia="fa-IR"/>
               </w:rPr>
-              <w:t>خیر → خارج از دامنهٔ راهنما</w:t>
             </w:r>
           </w:p>
         </w:tc>
@@ -2896,7 +2899,9 @@
               <w:jc w:val="center"/>
               <w:bidi w:val="1"/>
             </w:pPr>
-            <w:r/>
+            <w:r>
+              <w:t>اجرایی</w:t>
+            </w:r>
             <w:r>
               <w:rPr>
                 <w:rFonts w:ascii="Times New Roman" w:hAnsi="Times New Roman" w:cs="B Nazanin" w:eastAsia="B Nazanin"/>
@@ -2905,7 +2910,6 @@
                 <w:rtl w:val="1"/>
                 <w:lang w:val="en-US" w:bidi="fa-IR" w:eastAsia="fa-IR"/>
               </w:rPr>
-              <w:t>اجرایی</w:t>
             </w:r>
           </w:p>
         </w:tc>
@@ -3568,7 +3572,7 @@
           <w:rtl w:val="1"/>
           <w:lang w:val="en-US" w:bidi="fa-IR" w:eastAsia="fa-IR"/>
         </w:rPr>
-        <w:t xml:space="preserve">سیاست نردبان برای بسته‌ای با بازپخش، مداخله، کنترل منفی، بازه و حداقل شانزده بذر سطح ۴ را مجاز می‌کند؛ مصنوع HE01 همین شروط را حمل می‌کند. روی نمونهٔ جدول ۳ — بدون بازپخش و بدون مداخلهٔ یال — سطح در پایین نردبان می‌ماند. واژگان تنظیم‌گری سقف ادعا را بالا نمی‌برند.</w:t>
+        <w:t>بستهٔ جدول ۳ با سازندهٔ زمینهٔ کاربرد مدل تجهیز ساخته و حسابرسی شد. پرسش این بود که آیا جدول امتیاز، انتخاب اندازهٔ بدترین حالت را مجاز می‌کند. زمینهٔ کاربرد جدول مصنوعی است؛ آزمون ISO 14879-1 و ایمپلنت ندارد. تأثیر مدل ۲ و پیامد تصمیم ۳ است، پس ریسک مدل ۳ ثبت می‌شود. امتیاز درمان ۰٫۱۲ و ۰٫۱۱ و ۰٫۱۳، و امتیاز کنترل ۰٫۲۰ و ۰٫۱۹ و ۰٫۲۱ است. برچسب‌های همراه simd_declared، ردهٔ B از IEC 62304، دستهٔ II از IMDRF، دسته‌های شواهد ۱ و ۳ و ۸ از راهنمای FDA ۲۰۲۳، و مدل فیزیک‌محور بودند. خروجی حسابرس سطح ۰ با نام software_capability است. برای سطح ۱ فقط مانیفست مصنوع کم است. همان سیاست برای HE01 — با بازپخش، مداخله، کنترل منفی، بازه و سی بذر — سطح ۴ را مجاز می‌کند. برچسب ردهٔ نرم‌افزار و دستهٔ شواهد این فاصله را پر نمی‌کند.</w:t>
       </w:r>
     </w:p>
     <w:p>
@@ -3664,7 +3668,7 @@
           <w:rtl w:val="1"/>
           <w:lang w:val="en-US" w:bidi="fa-IR" w:eastAsia="fa-IR"/>
         </w:rPr>
-        <w:t xml:space="preserve">کودون‌تریس جنسیس اجرای قطعی، مداخلهٔ علّی و حسابرسی ادعا را روی یک نردبان واحد جمع می‌کند، در حالی که موتور نسبت به حوزه ناآگاه می‌ماند. پروفایل زیست‌پزشکی واژگان ASME V&amp;V 40، FDA ۲۰۲۳، IEC 62304 و IMDRF را روی همان پورت حمل می‌کند. ارزیابی HE01 اثر آماری را روی سنجهٔ اولیه نشان می‌دهد و سقف انتساب علّی را به طراحی بازوها محدود می‌کند. مسیر بعدی، ارزیابی بیرونی بسته‌های شواهد و اتصال مدل فیزیک‌محور واقعی تحت زمینهٔ کاربرد صریح است.</w:t>
+        <w:t>کودون‌تریس جنسیس اجرای قطعی، مداخلهٔ علّی و حسابرسی ادعا را روی یک نردبان واحد جمع می‌کند، در حالی که موتور نسبت به حوزه ناآگاه می‌ماند. پروفایل زیست‌پزشکی واژگان ASME V&amp;V 40، FDA ۲۰۲۳، IEC 62304 و IMDRF را روی همان پورت حمل می‌کند. HE01 اثر آماری را روی سنجهٔ انرژی نشان می‌دهد. بستهٔ اعلامی تجهیز، با ریسک مدل ۳ و همان برچسب‌ها، در سطح صفر ماند. مسیر بعدی، اتصال مدل فیزیک‌محور واقعی با مانیفست و زمینهٔ کاربرد صریح است.</w:t>
       </w:r>
     </w:p>
     <w:p>

</xml_diff>

<commit_message>
docs(baic): tighten the manuscript into a conference argument
Lead with the claim-evidence question, state three results, and keep
the HE01 numbers and the level-0 device bundle as the contrast. Drop
the module-path voice from the prose.
</commit_message>
<xml_diff>
--- a/paper/baic/BAIC2026_Jamei_final.docx
+++ b/paper/baic/BAIC2026_Jamei_final.docx
@@ -98,7 +98,7 @@
           <w:rtl w:val="1"/>
           <w:lang w:val="en-US" w:bidi="fa-IR" w:eastAsia="fa-IR"/>
         </w:rPr>
-        <w:t>چکیده - تناسب شواهد با ادعا، نه فقط یک عدد دقت، کیفیت مدل محاسباتی را در مهندسی پزشکی تعیین می‌کند. این مقاله کودون‌تریس جنسیس را به‌عنوان بستری واحد برای اجرای قطعی جهان شبیه‌سازی، مداخلهٔ علّی روی یال‌های سازوکار، و حسابرسی ادعا با نردبان شش‌سطحی معرفی می‌کند. موتور اجرا حوزه نمی‌شناسد؛ حوزه از پورت DomainProfile و آداپتور بستهٔ شواهد می‌آید. پروفایل زیست‌پزشکی همان نردبان را به واژگان ASME V&amp;V 40، راهنمای FDA ۲۰۲۳ برای اعتبار مدل‌سازی محاسباتی، IEC 62304 و IMDRF وصل می‌کند. در کمپین تأییدی HE01 با ۳۰ بذر جفتی، تفاضل انرژی در برابر کنترل کانالِ روشن ۱۶٫۴۹ واحد و بازهٔ BCa [۱۴٫۲۵، ۱۹٫۱۴] بود. اجرای همان حسابرس روی بستهٔ اعلامی یک مدل تجهیز، با ریسک مدل ۳ و برچسب‌های IEC و FDA، سطح صفر برگرداند.</w:t>
+        <w:t>چکیده - اعتبار مدل محاسباتی در مهندسی پزشکی با تناسب شواهد و ادعا سنجیده می‌شود. این مقاله کودون‌تریس جنسیس را به‌عنوان حسابرس اجرایی همین تناسب معرفی می‌کند: اجرای قطعی، مداخله روی یال سازوکار، و نردبان شش‌سطحی ادعا در یک بستر. موتور حوزه نمی‌شناسد؛ حوزه از پورت DomainProfile می‌آید. پروفایل زیست‌پزشکی واژگان ASME V&amp;V 40، راهنمای FDA ۲۰۲۳، IEC 62304 و IMDRF را روی همان نردبان می‌نشاند. در کمپین تأییدی HE01، سی بذر جفتی تفاضل انرژی ۱۶٫۴۹ واحد را در برابر کنترل کانالِ روشن نشان داد و بازهٔ BCa برابر [۱۴٫۲۵، ۱۹٫۱۴] بود. همان حسابرس، بستهٔ اعلامی یک مدل تجهیز را با ریسک مدل ۳ و برچسب‌های IEC و FDA در سطح صفر نگه داشت.</w:t>
       </w:r>
     </w:p>
     <w:p>
@@ -132,7 +132,7 @@
           <w:rtl w:val="1"/>
           <w:lang w:val="en-US" w:bidi="fa-IR" w:eastAsia="fa-IR"/>
         </w:rPr>
-        <w:t xml:space="preserve">کلید واژه- اعتبارسنجی in silico، حسابرسی شواهد، مدل‌سازی محاسباتی، بازپخش‌پذیری</w:t>
+        <w:t>کلید واژه- اعتبارسنجی in silico، حسابرسی شواهد، مدل‌سازی محاسباتی، نردبان اعتبار</w:t>
       </w:r>
     </w:p>
     <w:p>
@@ -164,7 +164,7 @@
           <w:rtl w:val="1"/>
           <w:lang w:val="en-US" w:bidi="fa-IR" w:eastAsia="fa-IR"/>
         </w:rPr>
-        <w:t xml:space="preserve">در مدل‌سازی محاسباتی برای تجهیزات و سامانه‌های پزشکی، پرسش اصلی «دقت مدل چند است؟» نیست؛ «شواهد موجود چه قوتی از ادعا را مجاز می‌کند؟» است. راهنمای سازمان غذا و داروی آمریکا در نوامبر ۲۰۲۳ چارچوبی ریسک‌آگاه برای اعتبار مدل‌سازی و شبیه‌سازی فیزیک‌محور در پروندهٔ تجهیز ارائه می‌کند و مدل‌های یادگیری ماشین مستقل را صراحتاً خارج از دامنه می‌گذارد [1]. هشت دستهٔ شواهد آن راهنما — راستی‌آزمایی کد، کالیبراسیون مدل، اعتبارسنجی نیمکت، اعتبارسنجی in vivo، اعتبارسنجی جمعیتی، رفتار پدیداری، معقول بودن مدل، و راستی‌آزمایی محاسبات همراه با کمی‌سازی عدم‌قطعیت — در این کار به‌صورت برچسب اعلامی روی پورت زیست‌پزشکی ذخیره می‌شوند. استاندارد ASME V&amp;V 40 اعتبار لازم را به پرسش مورد علاقه، زمینهٔ کاربرد و ریسک تصمیم گره می‌زند [2]. استاندارد NASA-STD-7009B ارزیابی قابلیت مدل و انتقال اعتبار نتایج را الزامی می‌کند [3]. پیوست چهارم قانون هوش مصنوعی اتحادیهٔ اروپا مستندسازی اعتبارسنجی را برای سامانه‌های مشمول مقرر می‌کند [4].</w:t>
+        <w:t>پرسش پروندهٔ یک مدل محاسباتی در تجهیزات پزشکی این نیست که مدل چند درصد دقیق است. پرسش این است که شواهد موجود کدام قوت از ادعا را مجاز می‌کند. راهنمای نوامبر ۲۰۲۳ سازمان غذا و داروی آمریکا برای مدل‌سازی و شبیه‌سازی فیزیک‌محور، اعتبار را به ریسک تصمیم گره می‌زند و مدل یادگیری ماشین مستقل را بیرون از دامنه می‌گذارد [1]. ASME V&amp;V 40 همین منطق را با پرسش مورد علاقه، زمینهٔ کاربرد و پیامد تصمیم صورت‌بندی می‌کند [2]. NASA-STD-7009B قابلیت خود مدل و جواز انتقال نتایج را جدا می‌خواهد [3]. پیوست چهارم قانون هوش مصنوعی اتحادیهٔ اروپا مستندسازی اعتبارسنجی را برای سامانه‌های مشمول الزام می‌کند [4]. این چهار سند زبان مشترک دارند و هیچ‌کدام، به‌تنهایی، ادعای چسبیده به یک مصنوع پژوهشی را درجه نمی‌دهند.</w:t>
       </w:r>
     </w:p>
     <w:p>
@@ -179,7 +179,7 @@
           <w:rtl w:val="1"/>
           <w:lang w:val="en-US" w:bidi="fa-IR" w:eastAsia="fa-IR"/>
         </w:rPr>
-        <w:t xml:space="preserve">Viceconti و همکاران چارچوب آزمون‌های in silico را بر تعریف زمینهٔ کاربرد، تحلیل ریسک، و زنجیرهٔ راستی‌آزمایی–اعتبارسنجی–کمی‌سازی عدم‌قطعیت بنا می‌کنند [5]. Pathmanathan و همکاران همین منطق را برای آزمون بالینی درسیلیکو به‌صورت گردش‌کار سلسله‌مراتبی اعتبار زیرمدل‌ها گسترش داده‌اند [17]. سمپوزیوم مشترک FDA/MDIC در آوریل ۲۰۲۴ اعتبار CM&amp;S را در سراسر چرخهٔ عمر تجهیز، از جمله دوقلوی دیجیتال و آزمون درسیلیکو، جمع‌بندی کرده است [18]. با این حال هیچ‌یک از این منابع به‌تنهایی یک حسابرس نرم‌افزاری برای ادعای همراه یک مصنوع پژوهشی نیستند. شکاف عملی دو لایه دارد. نخست در گزارش پژوهش: از میان ۸۵ مقالهٔ مبتنی بر مدل زبانی در ICSE و ASE ۲۰۲۴، هیچ‌یک از پنج مصنوع اجرایی کاملاً بازتولید نشد [6]. دوم در نگهداری شواهد: نشان بازتولید به‌تنهایی هویت و قوت ادعا را پس از انتشار حفظ نمی‌کند.</w:t>
+        <w:t>آزمون in silico، چنان‌که Viceconti و همکاران ساخته‌اند، بر زمینهٔ کاربرد، تحلیل ریسک و زنجیرهٔ راستی‌آزمایی، اعتبارسنجی و کمی‌سازی عدم‌قطعیت استوار است [5]. Pathmanathan و همکاران همین زنجیره را برای آزمون بالینی درسیلیکو تا اعتبار زیرمدل‌ها پایین برده‌اند [17]. جمع‌بندی سمپوزیوم FDA/MDIC در ۲۰۲۴ نیز اعتبار مدل را در سراسر عمر تجهیز، از دوقلوی دیجیتال تا آزمون درسیلیکو، دنبال می‌کند [18]. شکاف جای دیگر است. در گزارش پژوهش، از میان ۸۵ مقالهٔ متکی به مدل زبانی در ICSE و ASE ۲۰۲۴، هیچ مصنوع اجرایی از پنج نمونهٔ بررسی‌شده کاملاً بازتولید نشد [6]. حتی وقتی اجرا تکرار می‌شود، هویت ادعا و سقف مجاز آن پس از انتشار حفظ نمی‌شود. حسابرس این مقاله برای همان شکاف ساخته شده است.</w:t>
       </w:r>
     </w:p>
     <w:p>
@@ -194,7 +194,7 @@
           <w:rtl w:val="1"/>
           <w:lang w:val="en-US" w:bidi="fa-IR" w:eastAsia="fa-IR"/>
         </w:rPr>
-        <w:t>سهم این مقاله سه بخش است: (۱) یکپارچه‌سازی اجرای قطعی، مداخلهٔ یال‌به‌یال و حسابرسی شواهد در بستری که موتور آن برای پزشکی بازنویسی نمی‌شود؛ (۲) پروفایل زیست‌پزشکی که همان نردبان را به واژگان تنظیم‌گری وصل می‌کند؛ (۳) دو ارزیابی روی همان حسابرس: کمپین تأییدی HE01، و اجرای بستهٔ اعلامی یک مدل تجهیز که با ریسک مدل ۳ در سطح صفر ماند. تازگی مورد ادعا در این ترکیب اجرایی است.</w:t>
+        <w:t>سهم مقاله سه حکم است. نخست، اجرای قطعی، مداخلهٔ یال‌به‌یال و حسابرسی ادعا در یک بستر جمع شده‌اند و موتور برای پزشکی بازنویسی نمی‌شود. دوم، پروفایل زیست‌پزشکی همان نردبان را به واژگان تنظیم‌گری وصل می‌کند، بی‌آنکه برچسب را به تأیید تبدیل کند. سوم، یک حسابرس دو خروجی متمایز می‌دهد: کمپین تأییدی HE01 به سطح بالای نردبان می‌رسد، و بستهٔ اعلامی مدل تجهیز با ریسک مدل ۳ در سطح صفر می‌ماند. تازگی در این تفکیک اجرایی است.</w:t>
       </w:r>
     </w:p>
     <w:p>
@@ -226,7 +226,7 @@
           <w:rtl w:val="1"/>
           <w:lang w:val="en-US" w:bidi="fa-IR" w:eastAsia="fa-IR"/>
         </w:rPr>
-        <w:t xml:space="preserve">درجه‌بندی اعتبار پیشینهٔ طولانی دارد. ASME VVUQ 40.1-2026 یک گزارش فنی کامل برای شناسایی بدترین اندازهٔ سینی تیبیال در آزمون خستگی بر اساس ISO 14879-1 است [7]. IEC 62304 ردهٔ ایمنی نرم‌افزار پزشکی A/B/C را برای شدت فرایند چرخهٔ حیات تعریف می‌کند [8]. اسناد IMDRF زبان SiMD/SaMD و مشخصه‌سازی ریسک نرم‌افزار دستگاه را فراهم می‌سازند [9]، [10]. آنچه این مقاله می‌افزاید، اتصال اجرایی همان واژگان به یک نردبان قابل اجراست.</w:t>
+        <w:t>درجه‌بندی اعتبار سابقه دارد، اما تا امروز بیشتر در قالب گزارش و چارچوب مانده است. ASME VVUQ 40.1-2026 نمونهٔ کامل همین چارچوب را برای شناسایی بدترین اندازهٔ سینی تیبیال در آزمون خستگی ISO 14879-1 می‌نویسد [7]. IEC 62304 ردهٔ ایمنی نرم‌افزار پزشکی را A، B یا C می‌گذارد و شدت فرایند را به آن رده گره می‌زند [8]. اسناد IMDRF زبان SiMD و SaMD و مشخصه‌سازی ریسک نرم‌افزار دستگاه را تثبیت کرده‌اند [9]، [10]. این مقاله همان واژگان را به یک نردبان قابل اجرا وصل می‌کند.</w:t>
       </w:r>
     </w:p>
     <w:p>
@@ -241,7 +241,7 @@
           <w:rtl w:val="1"/>
           <w:lang w:val="en-US" w:bidi="fa-IR" w:eastAsia="fa-IR"/>
         </w:rPr>
-        <w:t xml:space="preserve">در محاسبات تکاملی، آویدا بستری کلاسیک برای برنامه‌های خودتکثیرشونده است [11]. آداپتور پروندهٔ .dat آن اسکلت است. ادبیات کیفیت‌تنوع بر ثبات عملکرد در محیط نامطمئن تأکید دارد [12] که با بازپخش بیت‌به‌بیت یک اجرای نرم‌افزار یکی نیست. توصیف مدل از منطق مستندسازی ODD بهره می‌برد [13]. درخواست asme_vv40_passed در پیکربندی ConfigurationError می‌دهد.</w:t>
+        <w:t>در سوی محاسبات تکاملی، آویدا بستر کلاسیک برنامه‌های خودتکثیرشونده است [11] و پروندهٔ .dat آن از همین پورت خوانده می‌شود. ثبات عملکرد در محیط نامطمئن، آن‌گونه که ادبیات کیفیت‌تنوع گزارش می‌کند [12]، با بازپخش بیت‌به‌بیت یک اجرای نرم‌افزار یکی نیست. توصیف مدل از منطق ODD گرفته شده است [13]. مرز طراحی صریح است: رشتهٔ asme_vv40_passed در پیکربندی پذیرفته نمی‌شود.</w:t>
       </w:r>
     </w:p>
     <w:p>
@@ -290,7 +290,7 @@
           <w:rtl w:val="1"/>
           <w:lang w:val="en-US" w:bidi="fa-IR" w:eastAsia="fa-IR"/>
         </w:rPr>
-        <w:t xml:space="preserve">هسته از ژنوم، عامل، جهان و زمان‌بند تشکیل شده است. تنظیمات ساختاریافته هنگام ایجاد اعتبارسنجی می‌شوند؛ گزینهٔ جدید با پیش‌فرض خاموش وارد می‌شود تا پیکربندی‌های پیشین پایدار بمانند. مسیر سازوکار از ژنوم و فنوتیپ به کنش، پیامد منابع، تجربه، کپسول دارای منشأ، انتقال، پذیرش، اعمال در سیاست گیرنده، بقا و تولیدمثل می‌رسد. شناسهٔ یال، دیجست‌های پیش و پس، و شمارنده‌های تلاش، پذیرش و اعمال ثبت می‌شوند تا انتقال پیام با تغییر رفتار یکی گرفته نشود. نسخهٔ نرم‌افزار از پروندهٔ پیکربندی پروژه خوانده می‌شود و در هویت بستهٔ شواهد سخت‌کد نیست.</w:t>
+        <w:t>هسته ژنوم، عامل، جهان و زمان‌بند است. هر تنظیم تازه با پیش‌فرض خاموش وارد می‌شود تا اجرای پیشین پایدار بماند. مسیر سازوکار از ژنوم به کنش، پیامد، کپسول منشأدار، پذیرش و سرانجام بقا می‌رسد. شناسهٔ یال و دیجست پیش و پس ثبت می‌شود تا عبور پیام با تغییر رفتار اشتباه گرفته نشود. نسخه از پروندهٔ پیکربندی پروژه خوانده می‌شود و داخل هویت بسته سخت‌کد نیست.</w:t>
       </w:r>
     </w:p>
     <w:p>
@@ -305,7 +305,7 @@
           <w:rtl w:val="1"/>
           <w:lang w:val="en-US" w:bidi="fa-IR" w:eastAsia="fa-IR"/>
         </w:rPr>
-        <w:t xml:space="preserve">موتور حوزه نمی‌شناسد. پزشکی، سخت‌افزار و زندگی مصنوعی از پورت متصل می‌شوند: آداپتور بستهٔ شواهد ClaimGate می‌سازد و DomainProfile برچسب حوزه را حمل می‌کند. افزودن حوزه یعنی پروفایل یا آداپتور جدید، نه انشعاب موتور. شکل ۱ مسیر مفهومی را نشان می‌دهد: آداپتور، بستهٔ شواهد، حسابرس، و نردبان صفر تا پنج؛ موتور فقط تیک، دیجست و بازپخش را اجرا می‌کند [14].</w:t>
+        <w:t>موتور حوزه نمی‌شناسد. پزشکی، سخت‌افزار و زندگی مصنوعی از پورت می‌آیند: آداپتور بستهٔ شواهد را می‌سازد و DomainProfile فقط برچسب حوزه را حمل می‌کند. حوزهٔ تازه یعنی پروفایل تازه، نه موتور دوم. شکل ۱ همین تفکیک را نشان می‌دهد. موتور تیک، دیجست و بازپخش را بر عهده دارد؛ حسابرس روی بسته کار می‌کند [14].</w:t>
       </w:r>
     </w:p>
     <w:p>
@@ -1150,7 +1150,7 @@
           <w:rtl w:val="1"/>
           <w:lang w:val="en-US" w:bidi="fa-IR" w:eastAsia="fa-IR"/>
         </w:rPr>
-        <w:t xml:space="preserve">الگوریتم حسابرسی در سطح معماری پنج گام دارد: (۱) آداپتور پرونده یا جدول را به بستهٔ claimgate_bundle_v1 برمی‌گرداند؛ (۲) نقش بازوها به پنج نقش عمومی نگاشته می‌شود — درمان، حذف سازوکار، خاموشی کانال، کنترل منفی، و دوز؛ (۳) دیجست پیکربندی و در صورت وجود دیجست پیش‌ثبت‌نامه بررسی می‌شود؛ (۴) بازپخش، مقایسه‌های جفتی، بازهٔ اطمینان و شمار بذر خوانده می‌شوند؛ (۵) حسابرس بالاترین سطحی را برمی‌گرداند که همهٔ شروطش برقرار است.</w:t>
+        <w:t>حسابرسی پنج گام است. آداپتور پرونده یا جدول را به یک بستهٔ واحد برمی‌گرداند. نقش بازوها به پنج نقش عام نگاشته می‌شود: درمان، حذف سازوکار، خاموشی کانال، کنترل منفی، و دوز. دیجست پیکربندی، و در صورت وجود دیجست پیش‌ثبت‌نامه، سنجیده می‌شود. سپس بازپخش، مقایسهٔ جفتی، بازهٔ اطمینان و شمار بذر خوانده می‌شود. حسابرس بالاترین سطحی را برمی‌گرداند که همهٔ شرط‌هایش برقرار است.</w:t>
       </w:r>
     </w:p>
     <w:p>
@@ -1182,7 +1182,7 @@
           <w:rtl w:val="1"/>
           <w:lang w:val="en-US" w:bidi="fa-IR" w:eastAsia="fa-IR"/>
         </w:rPr>
-        <w:t xml:space="preserve">حسابرس codontrace.claimgate از موتور جداست. نردبان عمومی شش سطح دارد. سطح ۳ به مداخله یا حذف یال، کنترل منفی و شواهد بازپخش نیاز دارد. سطح ۴ بازهٔ اطمینان و حداقل شانزده بذر را می‌افزاید. سطح ۵ به آرشیو، محدودیت‌های مستند و شواهد آماری و مداخله‌ای وابسته است. این آستانه‌ها سیاست همین پیاده‌سازی‌اند. برابری خروجی بازوها به‌تنهایی یک نتیجهٔ صفر معتبر را رد نمی‌کند؛ بی‌اعتباری آزمون وقتی اعلام می‌شود که بررسی تحقق مداخله نیز برقرار نباشد.</w:t>
+        <w:t>حسابرس از موتور جداست. نردبان شش سطح دارد. سطح ۳ مداخله یا حذف یال، کنترل منفی و بازپخش می‌خواهد. سطح ۴ بازهٔ اطمینان و دست‌کم شانزده بذر را می‌افزاید. سطح ۵ آرشیو، محدودیت مکتوب، و شواهد آماری و مداخله‌ای را با هم می‌خواهد. این آستانه‌ها سیاست همین پیاده‌سازی‌اند. برابری خروجی دو بازو، به‌خودی خود، یک صفر معتبر را باطل نمی‌کند. آزمون وقتی بی‌اعتبار است که تحقق خود مداخله هم برقرار نباشد.</w:t>
       </w:r>
     </w:p>
     <w:p>
@@ -1214,7 +1214,7 @@
           <w:rtl w:val="1"/>
           <w:lang w:val="en-US" w:bidi="fa-IR" w:eastAsia="fa-IR"/>
         </w:rPr>
-        <w:t xml:space="preserve">آداپتور بومی کمپین HE01 مصنوع JSON را می‌خواند و نقش‌های محلی را با canonical_role به طرح‌وارهٔ عمومی برمی‌گرداند؛ بایت مصنوع عوض نمی‌شود. آداپتورهای اسکلت Avida و MABE2 پروندهٔ .dat و CSV را می‌خوانند. آداپتور زیست‌پزشکی جدول امتیاز اعلامی را با زمینهٔ کاربرد و ریسک مدل پر می‌کند. پل ESP32 یک پورت سخت‌افزاری اختیاری است. پین پرونده‌های متنی با sha256_text_file پس از یکسان‌سازی CRLF→LF انجام می‌شود؛ هش مصنوع دودویی همچنان Path.read_bytes() است. پروتکل آماری پیش‌فرض، جایگشت علامت جفتی با تصحیح Holm و بازهٔ BCa است. بوت‌استرپ studentized و شمارش دقیق علامت برای n≤۴۰ اختیاری‌اند تا پین کمپین نشکند.</w:t>
+        <w:t>آداپتور HE01 مصنوع JSON را می‌خواند و نقش محلی را به نقش عام برمی‌گرداند؛ بایت پرونده دست نمی‌خورد. Avida و MABE2 از همین در وارد می‌شوند. آداپتور زیست‌پزشکی جدول امتیاز را با زمینهٔ کاربرد و ریسک مدل پر می‌کند. پل سخت‌افزاری اختیاری است. اثرانگشت متن پس از یکسان‌سازی سطر ساخته می‌شود و هش دودویی با Path.read_bytes() می‌ماند. پروتکل پیش‌فرض، جایگشت علامت جفتی با تصحیح Holm و بازهٔ BCa است. بوت‌استرپ studentized و شمارش دقیق علامت برای n≤۴۰ اختیاری‌اند و پین کمپین را جابه‌جا نمی‌کنند.</w:t>
       </w:r>
     </w:p>
     <w:p>
@@ -1246,7 +1246,7 @@
           <w:rtl w:val="1"/>
           <w:lang w:val="en-US" w:bidi="fa-IR" w:eastAsia="fa-IR"/>
         </w:rPr>
-        <w:t xml:space="preserve">اتصال پزشکی از طریق DomainProfile است (alife / biomedical / hardware) [15]. اعلام simd_declared یا samd_declared زبان IMDRF را روی بسته ثبت می‌کند. راهنمای ۲۰۲۳ FDA برای مدل فیزیک‌محور یا مکانیستی است؛ اگر physics_based نادرست باشد، دامنه out_of_scope_standalone_ml می‌شود حتی اگر دسته‌های شواهد اعلام شده باشند. رشته‌هایی مانند asme_vv40_passed، fda_cleared، clinical_validated و iec_62304_certified در پیکربندی پذیرفته نمی‌شوند. این رد شدن یک ویژگی طراحی است: حسابرس اجازه نمی‌دهد برچسب تأیید از یک جدول اعلامی کسب شود.</w:t>
+        <w:t>پزشکی از DomainProfile می‌آید: alife، biomedical، یا hardware [15]. simd_declared و samd_declared زبان IMDRF را روی بسته می‌نویسند و محصول را طبقه‌بندی نمی‌کنند. اگر مدل فیزیک‌محور اعلام نشده باشد، دامنه نسبت به راهنمای ۲۰۲۳ خارج از شمول می‌ماند، حتی وقتی دسته‌های شواهد پر شده باشند. رشته‌هایی مانند asme_vv40_passed، fda_cleared، clinical_validated و iec_62304_certified در پیکربندی راه ندارند. حسابرس اجازه نمی‌دهد تأیید از یک جدول اعلامی گرفته شود.</w:t>
       </w:r>
     </w:p>
     <w:p>
@@ -2136,7 +2136,7 @@
           <w:rtl w:val="1"/>
           <w:lang w:val="en-US" w:bidi="fa-IR" w:eastAsia="fa-IR"/>
         </w:rPr>
-        <w:t>جدول ۳ همان بسته‌ای است که حسابرس روی آن اجرا شده است: امتیازها مصنوعی‌اند، آزمون ISO 14879-1 و ایمپلنت در کار نیست، و سطح حاصل صفر است.</w:t>
+        <w:t>جدول ۳ بسته‌ای است که در بخش ارزیابی حسابرسی شده است. امتیازها برای نمایش قالب‌اند و سطح حاصل صفر است.</w:t>
       </w:r>
     </w:p>
     <w:p>
@@ -2961,7 +2961,7 @@
           <w:rtl w:val="1"/>
           <w:lang w:val="en-US" w:bidi="fa-IR" w:eastAsia="fa-IR"/>
         </w:rPr>
-        <w:t xml:space="preserve">کمپین HE01 یک طرح پیش‌ثبت‌شده برای سوگیری منشأ کپسول است. سی بذر جفتی، بازوی درمان source_bias_on را می‌سنجد. کنترل منفی تأییدی capsules_content_null است؛ capsules_off مسیر انتقال را حذف می‌کند؛ source_bias_off کانال را روشن نگه می‌دارد و سوگیری منشأ را برمی‌دارد؛ capsules_shuffled حساسیت به بر زدن محتواست. نردبان دوز اوراکل (oracle_capsule) الگوی پاسخ به شدت را جدا نگه می‌دارد. سنجهٔ اولیه میانگین ATP پایانی گیرنده است؛ این کمیت انرژی شبیه‌سازی‌شده است. سقف ادعا در مصنوع منتشرشده intervention_supported است. پروتکل آماری پیش‌فرض، جایگشت علامت جفتی با تصحیح Holm و بازهٔ BCa است.</w:t>
+        <w:t>HE01 طرح پیش‌ثبت‌شدهٔ سوگیری منشأ است. سی بذر جفتی بازوی درمان را در برابر چهار وضعیت کنترل می‌سنجد: محتوای تهی، کانال بسته، کانال روشن بدون سوگیری، و محتوای برزده. نردبان دوز جدا نگه داشته می‌شود تا الگوی پاسخ به شدت با اثر اصلی قاطی نشود. سنجهٔ اولیه میانگین انرژی پایانی گیرنده است؛ این انرژیِ شبیه‌سازی است. سقف ثبت‌شده در مصنوع intervention_supported است. آزمون پیش‌فرض، جایگشت علامت جفتی، تصحیح Holm و بازهٔ BCa است.</w:t>
       </w:r>
     </w:p>
     <w:p>
@@ -2976,7 +2976,7 @@
           <w:rtl w:val="1"/>
           <w:lang w:val="en-US" w:bidi="fa-IR" w:eastAsia="fa-IR"/>
         </w:rPr>
-        <w:t xml:space="preserve">مصنوع منتشرشدهٔ results_v7.json (پیشوند دیجست 28f812c5) سه کنتراست جفتی را گزارش می‌کند [16]. در برابر source_bias_off تفاضل ۱۶٫۴۹ واحد، p خام جایگشت ۴٫۹۹۹۷۵×۱۰⁻⁵، p تصحیح‌شدهٔ Holm ۱٫۵۰×۱۰⁻⁴ و بازهٔ BCa [۱۴٫۲۵، ۱۹٫۱۴] است. در برابر capsules_content_null و capsules_off تفاضل ۳۰٫۶۷ واحد با بازهٔ [۲۶٫۰۳، ۳۵٫۳۲] است. کنتراست در برابر کنترل محتوایی، محتوا و سوگیری منشأ را هم‌زمان تغییر می‌دهد؛ کنتراست در برابر source_bias_off کانال را ثابت نگه می‌دارد. بازتحلیل اختیاری همان ۳۰ تفاضل با بوت‌استرپ studentized بازهٔ بی‌دروازه را حدود ۱۴٫۰۵–۱۹٫۳۰ می‌دهد؛ این حساسیت روش است نه بازتقطیع فایل v7.</w:t>
+        <w:t>مصنوع results_v7.json با پیشوند دیجست 28f812c5 سه کنتراست جفتی را ثبت کرده است [16]. در برابر کانالِ روشن بدون سوگیری منشأ، تفاضل ۱۶٫۴۹ واحد است؛ p خام جایگشت ۴٫۹۹۹۷۵×۱۰⁻⁵، p تصحیح‌شده با Holm برابر ۱٫۵۰×۱۰⁻⁴، و بازهٔ BCa برابر [۱۴٫۲۵، ۱۹٫۱۴]. در برابر کانال بسته و محتوای تهی، تفاضل ۳۰٫۶۷ واحد و بازهٔ [۲۶٫۰۳، ۳۵٫۳۲] است. کنتراست نخست کانال را ثابت نگه می‌دارد و فقط سوگیری را برمی‌دارد؛ کنتراست دوم محتوا و سوگیری را با هم عوض می‌کند. بازتحلیل اختیاری همان سی تفاضل با بوت‌استرپ studentized بازه را حدود ۱۴٫۰۵ تا ۱۹٫۳۰ می‌گذارد. این حساسیت روش است، نه بازنویسی فایل.</w:t>
       </w:r>
     </w:p>
     <w:p>
@@ -3572,7 +3572,7 @@
           <w:rtl w:val="1"/>
           <w:lang w:val="en-US" w:bidi="fa-IR" w:eastAsia="fa-IR"/>
         </w:rPr>
-        <w:t>بستهٔ جدول ۳ با سازندهٔ زمینهٔ کاربرد مدل تجهیز ساخته و حسابرسی شد. پرسش این بود که آیا جدول امتیاز، انتخاب اندازهٔ بدترین حالت را مجاز می‌کند. زمینهٔ کاربرد جدول مصنوعی است؛ آزمون ISO 14879-1 و ایمپلنت ندارد. تأثیر مدل ۲ و پیامد تصمیم ۳ است، پس ریسک مدل ۳ ثبت می‌شود. امتیاز درمان ۰٫۱۲ و ۰٫۱۱ و ۰٫۱۳، و امتیاز کنترل ۰٫۲۰ و ۰٫۱۹ و ۰٫۲۱ است. برچسب‌های همراه simd_declared، ردهٔ B از IEC 62304، دستهٔ II از IMDRF، دسته‌های شواهد ۱ و ۳ و ۸ از راهنمای FDA ۲۰۲۳، و مدل فیزیک‌محور بودند. خروجی حسابرس سطح ۰ با نام software_capability است. برای سطح ۱ فقط مانیفست مصنوع کم است. همان سیاست برای HE01 — با بازپخش، مداخله، کنترل منفی، بازه و سی بذر — سطح ۴ را مجاز می‌کند. برچسب ردهٔ نرم‌افزار و دستهٔ شواهد این فاصله را پر نمی‌کند.</w:t>
+        <w:t>بستهٔ جدول ۳ با زمینهٔ کاربرد مدل تجهیز ساخته شد. پرسش این بود که آیا جدول امتیاز، انتخاب اندازهٔ بدترین حالت را مجاز می‌کند. زمینه، جدول امتیاز است؛ آزمون ISO 14879-1 و ایمپلنت در میان نیست. تأثیر مدل ۲ و پیامد تصمیم ۳ است، بنابراین ریسک مدل ۳ ثبت می‌شود. امتیاز درمان ۰٫۱۲، ۰٫۱۱ و ۰٫۱۳ و امتیاز کنترل ۰٫۲۰، ۰٫۱۹ و ۰٫۲۱ است. همراه بسته این برچسب‌ها نشسته‌اند: simd_declared، ردهٔ B از IEC 62304، دستهٔ II از IMDRF، دسته‌های شواهد ۱ و ۳ و ۸، و اعلام مدل فیزیک‌محور. حسابرس سطح صفر برگرداند. برای سطح یک فقط مانیفست مصنوع کم است. HE01، با بازپخش و مداخله و کنترل منفی و بازه و سی بذر، به سطح ۴ می‌رسد. فاصلهٔ این دو خروجی را هیچ برچسبی پر نمی‌کند.</w:t>
       </w:r>
     </w:p>
     <w:p>
@@ -3604,7 +3604,7 @@
           <w:rtl w:val="1"/>
           <w:lang w:val="en-US" w:bidi="fa-IR" w:eastAsia="fa-IR"/>
         </w:rPr>
-        <w:t xml:space="preserve">ASME V&amp;V 40 یک فرایند اعتبار مدل برای زمینهٔ کاربرد مشخص است. آنچه این نرم‌افزار فراهم می‌کند، ثبت پرسش، زمینه، تأثیر و پیامد به‌صورت اعلامی و سپس درجه‌بندی ادعای همراه بسته است. اگر کاربر مدل فیزیک‌محور واقعی با آزمون نیمکت و in vivo داشته باشد، همان شواهد بیرون از این نرم‌افزار جمع می‌شوند و به‌صورت برچسب دستهٔ FDA ۲۰۲۳ اعلام می‌گردند. کودون‌تریس جنسیس مکمل حسابرسی ادعاست. نسخه از پیکربندی پروژه خوانده می‌شود؛ این مقاله اعداد کمپین را با نوک شاخه بازتقطیع نمی‌کند.</w:t>
+        <w:t>ASME V&amp;V 40 فرایند اعتبار یک مدل در زمینهٔ کاربرد مشخص است. این بستر پرسش، زمینه، تأثیر و پیامد را ثبت می‌کند و سپس ادعای همراه بسته را درجه می‌دهد. شواهد نیمکت و in vivo بیرون از نرم‌افزار گرد می‌آیند و به‌صورت دستهٔ راهنمای FDA ۲۰۲۳ اعلام می‌شوند. کودون‌تریس مکمل حسابرسی ادعاست. نسخه از پیکربندی پروژه خوانده می‌شود و اعداد این مقاله از نوک شاخه بازتقطیع نشده‌اند.</w:t>
       </w:r>
     </w:p>
     <w:p>
@@ -3636,7 +3636,7 @@
           <w:rtl w:val="1"/>
           <w:lang w:val="en-US" w:bidi="fa-IR" w:eastAsia="fa-IR"/>
         </w:rPr>
-        <w:t xml:space="preserve">دامنهٔ این مطالعه، حسابرسی ادعای همراه مصنوع پژوهشی است. راهنمای FDA ۲۰۲۳ شامل مدل یادگیری ماشین مستقل نمی‌شود. حسابرس ارزیاب بیرونی نیست. در HE01 کنتراست محتوایی مداخلهٔ مرکب دارد و سه بازو روی سنجهٔ انرژی اشباع شده‌اند. آداپتورهای Avida و MABE2 اسکلت‌اند. بوت‌استرپ studentized و شمارش دقیق علامت پیش‌فرض نیستند.</w:t>
+        <w:t>دامنه، درجهٔ ادعای همراه مصنوع است. راهنمای FDA ۲۰۲۳ مدل یادگیری ماشین مستقل را پوشش نمی‌دهد. در HE01 کنتراست محتوایی مداخله‌ای مرکب است. گسترش بعدی، نشاندن مدل فیزیک‌محور واقعی با مانیفست و زمینهٔ کاربرد صریح روی همین پورت است.</w:t>
       </w:r>
     </w:p>
     <w:p>
@@ -3668,7 +3668,7 @@
           <w:rtl w:val="1"/>
           <w:lang w:val="en-US" w:bidi="fa-IR" w:eastAsia="fa-IR"/>
         </w:rPr>
-        <w:t>کودون‌تریس جنسیس اجرای قطعی، مداخلهٔ علّی و حسابرسی ادعا را روی یک نردبان واحد جمع می‌کند، در حالی که موتور نسبت به حوزه ناآگاه می‌ماند. پروفایل زیست‌پزشکی واژگان ASME V&amp;V 40، FDA ۲۰۲۳، IEC 62304 و IMDRF را روی همان پورت حمل می‌کند. HE01 اثر آماری را روی سنجهٔ انرژی نشان می‌دهد. بستهٔ اعلامی تجهیز، با ریسک مدل ۳ و همان برچسب‌ها، در سطح صفر ماند. مسیر بعدی، اتصال مدل فیزیک‌محور واقعی با مانیفست و زمینهٔ کاربرد صریح است.</w:t>
+        <w:t>کودون‌تریس جنسیس اجرای قطعی، مداخلهٔ علّی و حسابرسی ادعا را روی یک نردبان واحد می‌نشاند و موتور را نسبت به حوزه ناآگاه نگه می‌دارد. پروفایل زیست‌پزشکی زبان ASME V&amp;V 40، FDA ۲۰۲۳، IEC 62304 و IMDRF را حمل می‌کند. HE01 نشان می‌دهد که با شواهد جفتی، نردبان بالا می‌رود. بستهٔ اعلامی تجهیز نشان می‌دهد که با ریسک مدل ۳ و همان برچسب‌ها، نردبان در صفر می‌ماند. این تفکیک، نتیجهٔ مقاله است.</w:t>
       </w:r>
     </w:p>
     <w:p>

</xml_diff>

<commit_message>
docs(baic): plain Persian prose and the author email
Keep the official template, the HE01 numbers, and the level-0 device
bundle. Affiliation now uses parvaz.jamie@gmail.com and the ORCID URL.
</commit_message>
<xml_diff>
--- a/paper/baic/BAIC2026_Jamei_final.docx
+++ b/paper/baic/BAIC2026_Jamei_final.docx
@@ -66,7 +66,7 @@
           <w:rtl w:val="1"/>
           <w:lang w:val="en-US" w:bidi="fa-IR" w:eastAsia="fa-IR"/>
         </w:rPr>
-        <w:t xml:space="preserve">۱پژوهشگر مستقل، مشهد، ایران</w:t>
+        <w:t>۱پژوهشگر مستقل، مشهد، ایران، parvaz.jamie@gmail.com</w:t>
       </w:r>
     </w:p>
     <w:p>
@@ -82,7 +82,7 @@
           <w:rtl w:val="1"/>
           <w:lang w:val="en-US" w:bidi="fa-IR" w:eastAsia="fa-IR"/>
         </w:rPr>
-        <w:t xml:space="preserve">Parvaz Jamei | parvaz.nic@gmail.com | ORCID: 0009-0002-9980-270X</w:t>
+        <w:t>ORCID: https://orcid.org/0009-0002-9980-270X</w:t>
       </w:r>
     </w:p>
     <w:p>
@@ -98,7 +98,7 @@
           <w:rtl w:val="1"/>
           <w:lang w:val="en-US" w:bidi="fa-IR" w:eastAsia="fa-IR"/>
         </w:rPr>
-        <w:t>چکیده - اعتبار مدل محاسباتی در مهندسی پزشکی با تناسب شواهد و ادعا سنجیده می‌شود. این مقاله کودون‌تریس جنسیس را به‌عنوان حسابرس اجرایی همین تناسب معرفی می‌کند: اجرای قطعی، مداخله روی یال سازوکار، و نردبان شش‌سطحی ادعا در یک بستر. موتور حوزه نمی‌شناسد؛ حوزه از پورت DomainProfile می‌آید. پروفایل زیست‌پزشکی واژگان ASME V&amp;V 40، راهنمای FDA ۲۰۲۳، IEC 62304 و IMDRF را روی همان نردبان می‌نشاند. در کمپین تأییدی HE01، سی بذر جفتی تفاضل انرژی ۱۶٫۴۹ واحد را در برابر کنترل کانالِ روشن نشان داد و بازهٔ BCa برابر [۱۴٫۲۵، ۱۹٫۱۴] بود. همان حسابرس، بستهٔ اعلامی یک مدل تجهیز را با ریسک مدل ۳ و برچسب‌های IEC و FDA در سطح صفر نگه داشت.</w:t>
+        <w:t>چکیده - برای مدل محاسباتی در مهندسی پزشکی، عدد دقت به‌تنهایی کافی نیست و باید روشن باشد شواهد حاضر چه ادعایی را نگه می‌دارند. این مقاله بستر کودون‌تریس جنسیس را معرفی می‌کند: اجرا قطعی است، مداخله روی یال سازوکار ثبت می‌شود، و ادعا روی نردبانی شش‌سطحی حسابرسی می‌شود. خود موتور حوزه را نمی‌شناسد. برچسب حوزه از پورت DomainProfile می‌آید و پروفایل زیست‌پزشکی همان نردبان را با واژگان ASME V&amp;V 40، راهنمای FDA در سال ۲۰۲۳، IEC 62304 و IMDRF هماهنگ می‌کند. در کمپین HE01 با سی بذر جفتی، اختلاف انرژی نسبت به کنترل کانالِ روشن ۱۶٫۴۹ واحد و بازهٔ BCa برابر [۱۴٫۲۵، ۱۹٫۱۴] بود. اجرای همان حسابرس روی جدول اعلامی یک مدل تجهیز، با ریسک مدل ۳ و برچسب‌های IEC و FDA، در سطح صفر ماند.</w:t>
       </w:r>
     </w:p>
     <w:p>
@@ -164,7 +164,7 @@
           <w:rtl w:val="1"/>
           <w:lang w:val="en-US" w:bidi="fa-IR" w:eastAsia="fa-IR"/>
         </w:rPr>
-        <w:t>پرسش پروندهٔ یک مدل محاسباتی در تجهیزات پزشکی این نیست که مدل چند درصد دقیق است. پرسش این است که شواهد موجود کدام قوت از ادعا را مجاز می‌کند. راهنمای نوامبر ۲۰۲۳ سازمان غذا و داروی آمریکا برای مدل‌سازی و شبیه‌سازی فیزیک‌محور، اعتبار را به ریسک تصمیم گره می‌زند و مدل یادگیری ماشین مستقل را بیرون از دامنه می‌گذارد [1]. ASME V&amp;V 40 همین منطق را با پرسش مورد علاقه، زمینهٔ کاربرد و پیامد تصمیم صورت‌بندی می‌کند [2]. NASA-STD-7009B قابلیت خود مدل و جواز انتقال نتایج را جدا می‌خواهد [3]. پیوست چهارم قانون هوش مصنوعی اتحادیهٔ اروپا مستندسازی اعتبارسنجی را برای سامانه‌های مشمول الزام می‌کند [4]. این چهار سند زبان مشترک دارند و هیچ‌کدام، به‌تنهایی، ادعای چسبیده به یک مصنوع پژوهشی را درجه نمی‌دهند.</w:t>
+        <w:t>در پروندهٔ مدل محاسباتی برای تجهیز پزشکی، سؤال اصلی این نیست که مدل چند درصد درست گفته است. سؤال این است که با شواهد موجود تا کجا می‌شود ادعا کرد. راهنمای نوامبر ۲۰۲۳ سازمان غذا و داروی آمریکا اعتبار مدل‌سازی و شبیه‌سازی فیزیک‌محور را به ریسک تصمیم وصل می‌کند و مدل یادگیری ماشین مستقل را بیرون از دامنه می‌گذارد [1]. استاندارد ASME V&amp;V 40 همین نکته را با پرسش مورد علاقه، زمینهٔ کاربرد و پیامد تصمیم می‌نویسد [2]. NASA-STD-7009B جدا می‌خواهد که هم خود مدل قابل اتکا باشد و هم انتقال نتیجه به شرایط تازه مجاز باشد [3]. پیوست چهارم قانون هوش مصنوعی اتحادیهٔ اروپا نیز برای سامانه‌های مشمول، مستندسازی اعتبارسنجی را لازم کرده است [4]. این سندها زبان مشترکی دارند، اما هیچ‌کدام به‌تنهایی درجهٔ ادعای بسته‌شده به یک فایل پژوهشی را معلوم نمی‌کنند.</w:t>
       </w:r>
     </w:p>
     <w:p>
@@ -179,7 +179,7 @@
           <w:rtl w:val="1"/>
           <w:lang w:val="en-US" w:bidi="fa-IR" w:eastAsia="fa-IR"/>
         </w:rPr>
-        <w:t>آزمون in silico، چنان‌که Viceconti و همکاران ساخته‌اند، بر زمینهٔ کاربرد، تحلیل ریسک و زنجیرهٔ راستی‌آزمایی، اعتبارسنجی و کمی‌سازی عدم‌قطعیت استوار است [5]. Pathmanathan و همکاران همین زنجیره را برای آزمون بالینی درسیلیکو تا اعتبار زیرمدل‌ها پایین برده‌اند [17]. جمع‌بندی سمپوزیوم FDA/MDIC در ۲۰۲۴ نیز اعتبار مدل را در سراسر عمر تجهیز، از دوقلوی دیجیتال تا آزمون درسیلیکو، دنبال می‌کند [18]. شکاف جای دیگر است. در گزارش پژوهش، از میان ۸۵ مقالهٔ متکی به مدل زبانی در ICSE و ASE ۲۰۲۴، هیچ مصنوع اجرایی از پنج نمونهٔ بررسی‌شده کاملاً بازتولید نشد [6]. حتی وقتی اجرا تکرار می‌شود، هویت ادعا و سقف مجاز آن پس از انتشار حفظ نمی‌شود. حسابرس این مقاله برای همان شکاف ساخته شده است.</w:t>
+        <w:t>Viceconti و همکاران آزمون in silico را بر زمینهٔ کاربرد، تحلیل ریسک، و زنجیرهٔ راستی‌آزمایی، اعتبارسنجی و کمی‌سازی عدم‌قطعیت گذاشته‌اند [5]. Pathmanathan و همکاران همان زنجیره را تا اعتبار زیرمدل‌ها در آزمون بالینی درسیلیکو برده‌اند [17]. گزارش سمپوزیوم FDA/MDIC در سال ۲۰۲۴ هم اعتبار مدل را در طول عمر تجهیز، از جمله دوقلوی دیجیتال، جمع کرده است [18]. آنچه کم است ابزاری است که بعد از انتشار هم بگوید این مصنوع کدام سطح ادعا را پشتیبانی می‌کند. در بررسی ۸۵ مقالهٔ متکی به مدل زبانی در ICSE و ASE سال ۲۰۲۴، از پنج مصنوع اجرایی هیچ‌کدام کامل بازتولید نشد [6]. تکرار اجرا هم به‌خودی‌خود سقف ادعا را نگه نمی‌دارد. این مقاله برای همان کار نوشته شده است.</w:t>
       </w:r>
     </w:p>
     <w:p>
@@ -194,7 +194,7 @@
           <w:rtl w:val="1"/>
           <w:lang w:val="en-US" w:bidi="fa-IR" w:eastAsia="fa-IR"/>
         </w:rPr>
-        <w:t>سهم مقاله سه حکم است. نخست، اجرای قطعی، مداخلهٔ یال‌به‌یال و حسابرسی ادعا در یک بستر جمع شده‌اند و موتور برای پزشکی بازنویسی نمی‌شود. دوم، پروفایل زیست‌پزشکی همان نردبان را به واژگان تنظیم‌گری وصل می‌کند، بی‌آنکه برچسب را به تأیید تبدیل کند. سوم، یک حسابرس دو خروجی متمایز می‌دهد: کمپین تأییدی HE01 به سطح بالای نردبان می‌رسد، و بستهٔ اعلامی مدل تجهیز با ریسک مدل ۳ در سطح صفر می‌ماند. تازگی در این تفکیک اجرایی است.</w:t>
+        <w:t>در این بستر، اجرای قطعی، مداخلهٔ یال‌به‌یال و حسابرسی ادعا کنار هم آمده‌اند و موتور برای پزشکی از نو نوشته نشده است. پروفایل زیست‌پزشکی واژگان تنظیم‌گری را روی همان نردبان می‌گذارد و برچسب را به‌جای تأیید نمی‌نشاند. خروجی ارزیابی هم دو تاست: کمپین HE01 با شواهد جفتی بالا می‌رود و جدول اعلامی مدل تجهیز، با ریسک مدل ۳، در سطح صفر می‌ماند.</w:t>
       </w:r>
     </w:p>
     <w:p>
@@ -226,7 +226,7 @@
           <w:rtl w:val="1"/>
           <w:lang w:val="en-US" w:bidi="fa-IR" w:eastAsia="fa-IR"/>
         </w:rPr>
-        <w:t>درجه‌بندی اعتبار سابقه دارد، اما تا امروز بیشتر در قالب گزارش و چارچوب مانده است. ASME VVUQ 40.1-2026 نمونهٔ کامل همین چارچوب را برای شناسایی بدترین اندازهٔ سینی تیبیال در آزمون خستگی ISO 14879-1 می‌نویسد [7]. IEC 62304 ردهٔ ایمنی نرم‌افزار پزشکی را A، B یا C می‌گذارد و شدت فرایند را به آن رده گره می‌زند [8]. اسناد IMDRF زبان SiMD و SaMD و مشخصه‌سازی ریسک نرم‌افزار دستگاه را تثبیت کرده‌اند [9]، [10]. این مقاله همان واژگان را به یک نردبان قابل اجرا وصل می‌کند.</w:t>
+        <w:t>درجه‌بندی اعتبار سابقهٔ طولانی دارد، ولی اغلب در حد راهنما و گزارش نمونه مانده است. ASME VVUQ 40.1-2026 یک نمونهٔ کامل از همین چارچوب است و بدترین اندازهٔ سینی تیبیال را برای آزمون خستگی ISO 14879-1 مشخص می‌کند [7]. IEC 62304 ردهٔ ایمنی نرم‌افزار پزشکی را A، B یا C می‌گذارد و حجم کار چرخهٔ حیات را به همان رده وصل می‌کند [8]. اسناد IMDRF زبان SiMD و SaMD و نیز مشخصه‌سازی ریسک نرم‌افزار دستگاه را تثبیت کرده‌اند [9]، [10]. در این مقاله همان واژه‌ها به نردبانی وصل شده‌اند که روی بستهٔ شواهد اجرا می‌شود.</w:t>
       </w:r>
     </w:p>
     <w:p>
@@ -241,7 +241,7 @@
           <w:rtl w:val="1"/>
           <w:lang w:val="en-US" w:bidi="fa-IR" w:eastAsia="fa-IR"/>
         </w:rPr>
-        <w:t>در سوی محاسبات تکاملی، آویدا بستر کلاسیک برنامه‌های خودتکثیرشونده است [11] و پروندهٔ .dat آن از همین پورت خوانده می‌شود. ثبات عملکرد در محیط نامطمئن، آن‌گونه که ادبیات کیفیت‌تنوع گزارش می‌کند [12]، با بازپخش بیت‌به‌بیت یک اجرای نرم‌افزار یکی نیست. توصیف مدل از منطق ODD گرفته شده است [13]. مرز طراحی صریح است: رشتهٔ asme_vv40_passed در پیکربندی پذیرفته نمی‌شود.</w:t>
+        <w:t>آویدا بستر شناخته‌شده‌ای برای برنامه‌های خودتکثیرشونده است [11] و پروندهٔ .dat آن از همین در خوانده می‌شود. در ادبیات کیفیت‌تنوع، پایداری عملکرد در محیط نامطمئن [12] با بازپخش بیت‌به‌بیت یک اجرای نرم‌افزار یکی نیست. توصیف مدل بر اساس پروتکل ODD نوشته شده است [13]. در پیکربندی هم یک خط قرمز هست: رشتهٔ asme_vv40_passed پذیرفته نمی‌شود.</w:t>
       </w:r>
     </w:p>
     <w:p>
@@ -290,7 +290,7 @@
           <w:rtl w:val="1"/>
           <w:lang w:val="en-US" w:bidi="fa-IR" w:eastAsia="fa-IR"/>
         </w:rPr>
-        <w:t>هسته ژنوم، عامل، جهان و زمان‌بند است. هر تنظیم تازه با پیش‌فرض خاموش وارد می‌شود تا اجرای پیشین پایدار بماند. مسیر سازوکار از ژنوم به کنش، پیامد، کپسول منشأدار، پذیرش و سرانجام بقا می‌رسد. شناسهٔ یال و دیجست پیش و پس ثبت می‌شود تا عبور پیام با تغییر رفتار اشتباه گرفته نشود. نسخه از پروندهٔ پیکربندی پروژه خوانده می‌شود و داخل هویت بسته سخت‌کد نیست.</w:t>
+        <w:t>هسته از ژنوم، عامل، جهان و زمان‌بند ساخته شده است. هر تنظیم تازه با پیش‌فرض خاموش وارد می‌شود تا آزمایش‌های قبلی به‌هم نریزد. مسیر از ژنوم به کنش، پیامد، کپسول دارای منشأ، پذیرش و در نهایت بقا می‌رسد. برای هر یال، شناسه و اثرانگشت قبل و بعد ذخیره می‌شود تا عبور یک پیام با عوض شدن رفتار اشتباه گرفته نشود. شمارهٔ نسخه از پروندهٔ پیکربندی پروژه خوانده می‌شود و داخل بستهٔ شواهد ثابت نوشته نمی‌شود.</w:t>
       </w:r>
     </w:p>
     <w:p>
@@ -305,7 +305,7 @@
           <w:rtl w:val="1"/>
           <w:lang w:val="en-US" w:bidi="fa-IR" w:eastAsia="fa-IR"/>
         </w:rPr>
-        <w:t>موتور حوزه نمی‌شناسد. پزشکی، سخت‌افزار و زندگی مصنوعی از پورت می‌آیند: آداپتور بستهٔ شواهد را می‌سازد و DomainProfile فقط برچسب حوزه را حمل می‌کند. حوزهٔ تازه یعنی پروفایل تازه، نه موتور دوم. شکل ۱ همین تفکیک را نشان می‌دهد. موتور تیک، دیجست و بازپخش را بر عهده دارد؛ حسابرس روی بسته کار می‌کند [14].</w:t>
+        <w:t>موتور نمی‌داند آزمایش مربوط به پزشکی است یا زندگی مصنوعی یا سخت‌افزار. این برچسب از بیرون می‌آید. آداپتور بستهٔ شواهد را می‌سازد و DomainProfile فقط نام حوزه را با خود دارد. حوزهٔ تازه یعنی پروفایل تازه، نه موتور دوم. شکل ۱ همین جدایی را نشان می‌دهد. موتور تیک، اثرانگشت و بازپخش را انجام می‌دهد و حسابرس فقط بسته را می‌بیند [14].</w:t>
       </w:r>
     </w:p>
     <w:p>
@@ -1150,7 +1150,7 @@
           <w:rtl w:val="1"/>
           <w:lang w:val="en-US" w:bidi="fa-IR" w:eastAsia="fa-IR"/>
         </w:rPr>
-        <w:t>حسابرسی پنج گام است. آداپتور پرونده یا جدول را به یک بستهٔ واحد برمی‌گرداند. نقش بازوها به پنج نقش عام نگاشته می‌شود: درمان، حذف سازوکار، خاموشی کانال، کنترل منفی، و دوز. دیجست پیکربندی، و در صورت وجود دیجست پیش‌ثبت‌نامه، سنجیده می‌شود. سپس بازپخش، مقایسهٔ جفتی، بازهٔ اطمینان و شمار بذر خوانده می‌شود. حسابرس بالاترین سطحی را برمی‌گرداند که همهٔ شرط‌هایش برقرار است.</w:t>
+        <w:t>حسابرسی پنج مرحله دارد. آداپتور پرونده یا جدول را به یک بستهٔ واحد برمی‌گرداند. نقش بازوها به پنج نقش کلی نگاشت می‌شود: درمان، حذف سازوکار، خاموش کردن کانال، کنترل منفی، و دوز. اثرانگشت پیکربندی و، اگر موجود باشد، اثرانگشت پیش‌ثبت‌نامه بررسی می‌شود. سپس بازپخش، مقایسهٔ جفتی، بازهٔ اطمینان و تعداد بذر خوانده می‌شود. بالاترین سطحی برمی‌گردد که همهٔ شرط‌هایش برقرار باشد.</w:t>
       </w:r>
     </w:p>
     <w:p>
@@ -1182,7 +1182,7 @@
           <w:rtl w:val="1"/>
           <w:lang w:val="en-US" w:bidi="fa-IR" w:eastAsia="fa-IR"/>
         </w:rPr>
-        <w:t>حسابرس از موتور جداست. نردبان شش سطح دارد. سطح ۳ مداخله یا حذف یال، کنترل منفی و بازپخش می‌خواهد. سطح ۴ بازهٔ اطمینان و دست‌کم شانزده بذر را می‌افزاید. سطح ۵ آرشیو، محدودیت مکتوب، و شواهد آماری و مداخله‌ای را با هم می‌خواهد. این آستانه‌ها سیاست همین پیاده‌سازی‌اند. برابری خروجی دو بازو، به‌خودی خود، یک صفر معتبر را باطل نمی‌کند. آزمون وقتی بی‌اعتبار است که تحقق خود مداخله هم برقرار نباشد.</w:t>
+        <w:t>حسابرس از موتور جداست و شش سطح دارد. سطح ۳ به مداخله یا حذف یال، کنترل منفی و بازپخش نیاز دارد. سطح ۴ بازهٔ اطمینان و حداقل شانزده بذر را هم می‌خواهد. سطح ۵ علاوه بر اینها آرشیو، محدودیت نوشته‌شده، و شواهد آماری و مداخله‌ای را با هم لازم دارد. این آستانه‌ها مربوط به همین پیاده‌سازی است. برابر بودن خروجی دو بازو، به‌خودی‌خود، نتیجه را باطل نمی‌کند. آزمون وقتی بی‌اعتبار شمرده می‌شود که خود مداخله هم اعمال نشده باشد.</w:t>
       </w:r>
     </w:p>
     <w:p>
@@ -1214,7 +1214,7 @@
           <w:rtl w:val="1"/>
           <w:lang w:val="en-US" w:bidi="fa-IR" w:eastAsia="fa-IR"/>
         </w:rPr>
-        <w:t>آداپتور HE01 مصنوع JSON را می‌خواند و نقش محلی را به نقش عام برمی‌گرداند؛ بایت پرونده دست نمی‌خورد. Avida و MABE2 از همین در وارد می‌شوند. آداپتور زیست‌پزشکی جدول امتیاز را با زمینهٔ کاربرد و ریسک مدل پر می‌کند. پل سخت‌افزاری اختیاری است. اثرانگشت متن پس از یکسان‌سازی سطر ساخته می‌شود و هش دودویی با Path.read_bytes() می‌ماند. پروتکل پیش‌فرض، جایگشت علامت جفتی با تصحیح Holm و بازهٔ BCa است. بوت‌استرپ studentized و شمارش دقیق علامت برای n≤۴۰ اختیاری‌اند و پین کمپین را جابه‌جا نمی‌کنند.</w:t>
+        <w:t>آداپتور HE01 فایل JSON را می‌خواند و نقش محلی را به نقش کلی برمی‌گرداند. بایت خود پرونده عوض نمی‌شود. پروندهٔ Avida و خروجی CSV مربوط به MABE2 هم از همین مسیر وارد می‌شوند. آداپتور زیست‌پزشکی جدول امتیاز را با زمینهٔ کاربرد و ریسک مدل پر می‌کند. اتصال سخت‌افزاری **اختیاری** است. برای فایل متنی، اثرانگشت بعد از یکسان‌سازی انتهای سطر ساخته می‌شود و هش فایل دودویی با Path.read_bytes() حساب می‌شود. آزمون پیش‌فرض، جایگشت علامت جفتی با تصحیح Holm و بازهٔ BCa است. بوت‌استرپ studentized و شمارش دقیق علامت برای n≤۴۰ اختیاری‌اند تا اعداد کمپین منتشرشده جابه‌جا نشود.</w:t>
       </w:r>
     </w:p>
     <w:p>
@@ -1246,7 +1246,7 @@
           <w:rtl w:val="1"/>
           <w:lang w:val="en-US" w:bidi="fa-IR" w:eastAsia="fa-IR"/>
         </w:rPr>
-        <w:t>پزشکی از DomainProfile می‌آید: alife، biomedical، یا hardware [15]. simd_declared و samd_declared زبان IMDRF را روی بسته می‌نویسند و محصول را طبقه‌بندی نمی‌کنند. اگر مدل فیزیک‌محور اعلام نشده باشد، دامنه نسبت به راهنمای ۲۰۲۳ خارج از شمول می‌ماند، حتی وقتی دسته‌های شواهد پر شده باشند. رشته‌هایی مانند asme_vv40_passed، fda_cleared، clinical_validated و iec_62304_certified در پیکربندی راه ندارند. حسابرس اجازه نمی‌دهد تأیید از یک جدول اعلامی گرفته شود.</w:t>
+        <w:t>حوزهٔ پزشکی از DomainProfile می‌آید. نام‌های موجود alife، biomedical و hardware هستند [15]. simd_declared و samd_declared عبارت IMDRF را روی بسته یادداشت می‌کنند و خود محصول را رده‌بندی نمی‌کنند. اگر مدل فیزیک‌محور اعلام نشده باشد، نسبت به راهنمای سال ۲۰۲۳ خارج از دامنه می‌ماند، حتی وقتی خانه‌های شواهد پر شده باشند. رشته‌هایی مانند asme_vv40_passed، fda_cleared، clinical_validated و iec_62304_certified در پیکربندی قبول نمی‌شوند. از یک جدول اعلامی مهر تأیید بیرون نمی‌آید.</w:t>
       </w:r>
     </w:p>
     <w:p>
@@ -2136,7 +2136,7 @@
           <w:rtl w:val="1"/>
           <w:lang w:val="en-US" w:bidi="fa-IR" w:eastAsia="fa-IR"/>
         </w:rPr>
-        <w:t>جدول ۳ بسته‌ای است که در بخش ارزیابی حسابرسی شده است. امتیازها برای نمایش قالب‌اند و سطح حاصل صفر است.</w:t>
+        <w:t>جدول ۳ همان بسته‌ای است که در بخش ارزیابی به حسابرس داده شده است. امتیازها برای نشان دادن قالب جدول‌اند و سطحی که برمی‌گردد صفر است.</w:t>
       </w:r>
     </w:p>
     <w:p>
@@ -2961,7 +2961,7 @@
           <w:rtl w:val="1"/>
           <w:lang w:val="en-US" w:bidi="fa-IR" w:eastAsia="fa-IR"/>
         </w:rPr>
-        <w:t>HE01 طرح پیش‌ثبت‌شدهٔ سوگیری منشأ است. سی بذر جفتی بازوی درمان را در برابر چهار وضعیت کنترل می‌سنجد: محتوای تهی، کانال بسته، کانال روشن بدون سوگیری، و محتوای برزده. نردبان دوز جدا نگه داشته می‌شود تا الگوی پاسخ به شدت با اثر اصلی قاطی نشود. سنجهٔ اولیه میانگین انرژی پایانی گیرنده است؛ این انرژیِ شبیه‌سازی است. سقف ثبت‌شده در مصنوع intervention_supported است. آزمون پیش‌فرض، جایگشت علامت جفتی، تصحیح Holm و بازهٔ BCa است.</w:t>
+        <w:t>HE01 طرحی از پیش ثبت‌شده برای سنجش سوگیری منشأ کپسول است. سی بذر جفتی، بازوی درمان را با چهار کنترل مقایسه می‌کند: محتوای تهی، کانال بسته، کانال روشن بدون سوگیری، و محتوای برخورده. پاسخ به شدت دوز جدا نگه داشته می‌شود تا با اثر اصلی مخلوط نشود. سنجهٔ اصلی میانگین انرژی پایانی گیرنده است و این انرژی داخل شبیه‌سازی تعریف شده، نه یک کمیت زیستی. در مصنوع منتشرشده سقف ادعا intervention_supported است. آزمون پیش‌فرض، جایگشت علامت جفتی، تصحیح Holm و بازهٔ BCa است.</w:t>
       </w:r>
     </w:p>
     <w:p>
@@ -2976,7 +2976,7 @@
           <w:rtl w:val="1"/>
           <w:lang w:val="en-US" w:bidi="fa-IR" w:eastAsia="fa-IR"/>
         </w:rPr>
-        <w:t>مصنوع results_v7.json با پیشوند دیجست 28f812c5 سه کنتراست جفتی را ثبت کرده است [16]. در برابر کانالِ روشن بدون سوگیری منشأ، تفاضل ۱۶٫۴۹ واحد است؛ p خام جایگشت ۴٫۹۹۹۷۵×۱۰⁻⁵، p تصحیح‌شده با Holm برابر ۱٫۵۰×۱۰⁻⁴، و بازهٔ BCa برابر [۱۴٫۲۵، ۱۹٫۱۴]. در برابر کانال بسته و محتوای تهی، تفاضل ۳۰٫۶۷ واحد و بازهٔ [۲۶٫۰۳، ۳۵٫۳۲] است. کنتراست نخست کانال را ثابت نگه می‌دارد و فقط سوگیری را برمی‌دارد؛ کنتراست دوم محتوا و سوگیری را با هم عوض می‌کند. بازتحلیل اختیاری همان سی تفاضل با بوت‌استرپ studentized بازه را حدود ۱۴٫۰۵ تا ۱۹٫۳۰ می‌گذارد. این حساسیت روش است، نه بازنویسی فایل.</w:t>
+        <w:t>فایل results_v7.json با پیشوند اثرانگشت 28f812c5 سه مقایسهٔ جفتی دارد [16]. نسبت به کانال روشن و بدون سوگیری منشأ، اختلاف ۱۶٫۴۹ واحد است. p خام جایگشت ۴٫۹۹۹۷۵×۱۰⁻⁵ و p پس از Holm برابر ۱٫۵۰×۱۰⁻⁴ است. بازهٔ BCa نیز [۱۴٫۲۵، ۱۹٫۱۴] است. نسبت به کانال بسته و محتوای تهی، اختلاف ۳۰٫۶۷ واحد و بازهٔ [۲۶٫۰۳، ۳۵٫۳۲] است. در مقایسهٔ اول کانال سر جای خود می‌ماند و فقط سوگیری برداشته می‌شود. در مقایسهٔ دوم هم محتوا عوض می‌شود و هم سوگیری. اگر همان سی اختلاف را با بوت‌استرپ studentized، که اختیاری است، دوباره حساب کنیم، بازه حدود ۱۴٫۰۵ تا ۱۹٫۳۰ می‌شود. این تفاوت از روش می‌آید و فایل v7 دست نخورده است.</w:t>
       </w:r>
     </w:p>
     <w:p>
@@ -3572,7 +3572,7 @@
           <w:rtl w:val="1"/>
           <w:lang w:val="en-US" w:bidi="fa-IR" w:eastAsia="fa-IR"/>
         </w:rPr>
-        <w:t>بستهٔ جدول ۳ با زمینهٔ کاربرد مدل تجهیز ساخته شد. پرسش این بود که آیا جدول امتیاز، انتخاب اندازهٔ بدترین حالت را مجاز می‌کند. زمینه، جدول امتیاز است؛ آزمون ISO 14879-1 و ایمپلنت در میان نیست. تأثیر مدل ۲ و پیامد تصمیم ۳ است، بنابراین ریسک مدل ۳ ثبت می‌شود. امتیاز درمان ۰٫۱۲، ۰٫۱۱ و ۰٫۱۳ و امتیاز کنترل ۰٫۲۰، ۰٫۱۹ و ۰٫۲۱ است. همراه بسته این برچسب‌ها نشسته‌اند: simd_declared، ردهٔ B از IEC 62304، دستهٔ II از IMDRF، دسته‌های شواهد ۱ و ۳ و ۸، و اعلام مدل فیزیک‌محور. حسابرس سطح صفر برگرداند. برای سطح یک فقط مانیفست مصنوع کم است. HE01، با بازپخش و مداخله و کنترل منفی و بازه و سی بذر، به سطح ۴ می‌رسد. فاصلهٔ این دو خروجی را هیچ برچسبی پر نمی‌کند.</w:t>
+        <w:t>جدول ۳ با زمینهٔ کاربرد یک مدل تجهیز ساخته و به حسابرس داده شد. سؤال این بود که آیا جدول امتیاز اجازه می‌دهد اندازهٔ بدترین حالت انتخاب شود. زمینه فقط همان جدول است و آزمون ISO 14879-1 و ایمپلنت در میان نیست. تأثیر مدل ۲ و پیامد تصمیم ۳ اعلام شده، بنابراین ریسک مدل ۳ ثبت می‌شود. امتیاز درمان ۰٫۱۲، ۰٫۱۱ و ۰٫۱۳ و امتیاز کنترل ۰٫۲۰، ۰٫۱۹ و ۰٫۲۱ است. برچسب‌های همراه عبارت‌اند از simd_declared، ردهٔ B در IEC 62304، دستهٔ II در IMDRF، دسته‌های شواهد ۱ و ۳ و ۸، و اعلام فیزیک‌محور بودن مدل. خروجی سطح صفر بود. برای سطح ۱ فقط مانیفست مصنوع کم است. HE01 چون بازپخش، مداخله، کنترل منفی، بازه و سی بذر دارد به سطح ۴ می‌رسد. برچسب رده و دستهٔ شواهد این فاصله را عوض نمی‌کند.</w:t>
       </w:r>
     </w:p>
     <w:p>
@@ -3604,7 +3604,7 @@
           <w:rtl w:val="1"/>
           <w:lang w:val="en-US" w:bidi="fa-IR" w:eastAsia="fa-IR"/>
         </w:rPr>
-        <w:t>ASME V&amp;V 40 فرایند اعتبار یک مدل در زمینهٔ کاربرد مشخص است. این بستر پرسش، زمینه، تأثیر و پیامد را ثبت می‌کند و سپس ادعای همراه بسته را درجه می‌دهد. شواهد نیمکت و in vivo بیرون از نرم‌افزار گرد می‌آیند و به‌صورت دستهٔ راهنمای FDA ۲۰۲۳ اعلام می‌شوند. کودون‌تریس مکمل حسابرسی ادعاست. نسخه از پیکربندی پروژه خوانده می‌شود و اعداد این مقاله از نوک شاخه بازتقطیع نشده‌اند.</w:t>
+        <w:t>ASME V&amp;V 40 روش اعتبار یک مدل در زمینهٔ کاربرد مشخص است. در این بستر، پرسش، زمینه، تأثیر و پیامد ثبت می‌شود و سپس ادعای همراه بسته درجه می‌گیرد. اگر آزمون نیمکت یا in vivo در دست باشد، بیرون از نرم‌افزار جمع می‌شود و فقط به شکل دستهٔ راهنمای FDA ۲۰۲۳ اعلام می‌گردد. کودون‌تریس جای آن آزمون‌ها را نمی‌گیرد و حساب ادعا را نگه می‌دارد. نسخه از پیکربندی پروژه خوانده می‌شود و اعداد کمپین در این متن دوباره تولید نشده‌اند.</w:t>
       </w:r>
     </w:p>
     <w:p>
@@ -3636,7 +3636,7 @@
           <w:rtl w:val="1"/>
           <w:lang w:val="en-US" w:bidi="fa-IR" w:eastAsia="fa-IR"/>
         </w:rPr>
-        <w:t>دامنه، درجهٔ ادعای همراه مصنوع است. راهنمای FDA ۲۰۲۳ مدل یادگیری ماشین مستقل را پوشش نمی‌دهد. در HE01 کنتراست محتوایی مداخله‌ای مرکب است. گسترش بعدی، نشاندن مدل فیزیک‌محور واقعی با مانیفست و زمینهٔ کاربرد صریح روی همین پورت است.</w:t>
+        <w:t>موضوع این مطالعه درجهٔ ادعای همراه مصنوع است. راهنمای FDA سال ۲۰۲۳ مدل یادگیری ماشین مستقل را در بر نمی‌گیرد. در HE01 مقایسه با کنترل محتوایی، مداخله‌ای مرکب است. گام بعدی، گذاشتن مدل فیزیک‌محور واقعی با مانیفست و زمینهٔ کاربرد مشخص روی همین پورت است.</w:t>
       </w:r>
     </w:p>
     <w:p>
@@ -3668,7 +3668,7 @@
           <w:rtl w:val="1"/>
           <w:lang w:val="en-US" w:bidi="fa-IR" w:eastAsia="fa-IR"/>
         </w:rPr>
-        <w:t>کودون‌تریس جنسیس اجرای قطعی، مداخلهٔ علّی و حسابرسی ادعا را روی یک نردبان واحد می‌نشاند و موتور را نسبت به حوزه ناآگاه نگه می‌دارد. پروفایل زیست‌پزشکی زبان ASME V&amp;V 40، FDA ۲۰۲۳، IEC 62304 و IMDRF را حمل می‌کند. HE01 نشان می‌دهد که با شواهد جفتی، نردبان بالا می‌رود. بستهٔ اعلامی تجهیز نشان می‌دهد که با ریسک مدل ۳ و همان برچسب‌ها، نردبان در صفر می‌ماند. این تفکیک، نتیجهٔ مقاله است.</w:t>
+        <w:t>کودون‌تریس جنسیس اجرا، مداخله و حسابرسی ادعا را روی یک نردبان جمع کرده و موتور را نسبت به حوزه بی‌طرف گذاشته است. پروفایل زیست‌پزشکی واژگان ASME V&amp;V 40، راهنمای FDA ۲۰۲۳، IEC 62304 و IMDRF را به همین نردبان می‌آورد. HE01 اختلاف انرژی را با بازهٔ اطمینان و سی بذر جفتی نشان داد. جدول اعلامی تجهیز، با ریسک مدل ۳ و برچسب‌های تنظیم‌گری، در سطح صفر ماند. برچسب استاندارد به‌تنهایی سطح ادعا را بالا نمی‌برد.</w:t>
       </w:r>
     </w:p>
     <w:p>

</xml_diff>

<commit_message>
docs(baic): superscript the author mark and correct the HE01 port cell
The adapter reads the committed artifact. It does not run the world.
</commit_message>
<xml_diff>
--- a/paper/baic/BAIC2026_Jamei_final.docx
+++ b/paper/baic/BAIC2026_Jamei_final.docx
@@ -50,7 +50,18 @@
           <w:rtl w:val="1"/>
           <w:lang w:val="en-US" w:bidi="fa-IR" w:eastAsia="fa-IR"/>
         </w:rPr>
-        <w:t xml:space="preserve">پرواز جمیعی۱</w:t>
+        <w:t xml:space="preserve">پرواز جمیعی</w:t>
+      </w:r>
+      <w:r>
+        <w:rPr>
+          <w:rFonts w:ascii="Times New Roman" w:hAnsi="Times New Roman" w:cs="B Nazanin" w:eastAsia="B Nazanin"/>
+          <w:b/>
+          <w:sz w:val="22"/>
+          <w:rtl w:val="1"/>
+          <w:lang w:val="en-US" w:bidi="fa-IR" w:eastAsia="fa-IR"/>
+          <w:vertAlign w:val="superscript"/>
+        </w:rPr>
+        <w:t xml:space="preserve">۱</w:t>
       </w:r>
     </w:p>
     <w:p>
@@ -59,6 +70,16 @@
         <w:jc w:val="center"/>
         <w:bidi w:val="1"/>
       </w:pPr>
+      <w:r>
+        <w:rPr>
+          <w:rFonts w:ascii="Times New Roman" w:hAnsi="Times New Roman" w:cs="B Nazanin" w:eastAsia="B Nazanin"/>
+          <w:sz w:val="18"/>
+          <w:rtl w:val="1"/>
+          <w:lang w:val="en-US" w:bidi="fa-IR" w:eastAsia="fa-IR"/>
+          <w:vertAlign w:val="superscript"/>
+        </w:rPr>
+        <w:t xml:space="preserve">۱</w:t>
+      </w:r>
       <w:r>
         <w:rPr>
           <w:rFonts w:ascii="Times New Roman" w:hAnsi="Times New Roman" w:cs="B Nazanin" w:eastAsia="B Nazanin"/>
@@ -66,7 +87,7 @@
           <w:rtl w:val="1"/>
           <w:lang w:val="en-US" w:bidi="fa-IR" w:eastAsia="fa-IR"/>
         </w:rPr>
-        <w:t>۱پژوهشگر مستقل، مشهد، ایران، parvaz.jamie@gmail.com</w:t>
+        <w:t>پژوهشگر مستقل، مشهد، ایران، parvaz.jamie@gmail.com</w:t>
       </w:r>
     </w:p>
     <w:p>
@@ -571,7 +592,9 @@
               <w:jc w:val="center"/>
               <w:bidi w:val="1"/>
             </w:pPr>
-            <w:r/>
+            <w:r>
+              <w:t>خواندن مصنوع</w:t>
+            </w:r>
             <w:r>
               <w:rPr>
                 <w:rFonts w:ascii="Times New Roman" w:hAnsi="Times New Roman" w:cs="B Nazanin" w:eastAsia="B Nazanin"/>
@@ -580,7 +603,6 @@
                 <w:rtl w:val="1"/>
                 <w:lang w:val="en-US" w:bidi="fa-IR" w:eastAsia="fa-IR"/>
               </w:rPr>
-              <w:t>اجرای جهان</w:t>
             </w:r>
           </w:p>
         </w:tc>

</xml_diff>